<commit_message>
Power BI Task 3 updated
</commit_message>
<xml_diff>
--- a/PowerBI Task 3/PowerBILab3_Tutisani.docx
+++ b/PowerBI Task 3/PowerBILab3_Tutisani.docx
@@ -67,10 +67,10 @@
           <w:b/>
         </w:rPr>
         <w:drawing>
-          <wp:inline distT="0" distB="0" distL="0" distR="0" wp14:anchorId="4BC336EB" wp14:editId="01FD5DE3">
-            <wp:extent cx="5943600" cy="3458845"/>
-            <wp:effectExtent l="0" t="0" r="0" b="8255"/>
-            <wp:docPr id="514641085" name="Picture 1"/>
+          <wp:inline distT="0" distB="0" distL="0" distR="0" wp14:anchorId="177A32E8" wp14:editId="326C8208">
+            <wp:extent cx="5943600" cy="5394960"/>
+            <wp:effectExtent l="0" t="0" r="0" b="0"/>
+            <wp:docPr id="894287721" name="Picture 1"/>
             <wp:cNvGraphicFramePr>
               <a:graphicFrameLocks xmlns:a="http://schemas.openxmlformats.org/drawingml/2006/main" noChangeAspect="1"/>
             </wp:cNvGraphicFramePr>
@@ -78,7 +78,7 @@
               <a:graphicData uri="http://schemas.openxmlformats.org/drawingml/2006/picture">
                 <pic:pic xmlns:pic="http://schemas.openxmlformats.org/drawingml/2006/picture">
                   <pic:nvPicPr>
-                    <pic:cNvPr id="514641085" name=""/>
+                    <pic:cNvPr id="894287721" name=""/>
                     <pic:cNvPicPr/>
                   </pic:nvPicPr>
                   <pic:blipFill>
@@ -90,7 +90,7 @@
                   <pic:spPr>
                     <a:xfrm>
                       <a:off x="0" y="0"/>
-                      <a:ext cx="5943600" cy="3458845"/>
+                      <a:ext cx="5943600" cy="5394960"/>
                     </a:xfrm>
                     <a:prstGeom prst="rect">
                       <a:avLst/>
@@ -286,24 +286,14 @@
       <w:r>
         <w:t xml:space="preserve">Screenshot </w:t>
       </w:r>
-      <w:r>
-        <w:fldChar w:fldCharType="begin"/>
-      </w:r>
-      <w:r>
-        <w:instrText xml:space="preserve"> SEQ Screenshot \* ARABIC </w:instrText>
-      </w:r>
-      <w:r>
-        <w:fldChar w:fldCharType="separate"/>
-      </w:r>
-      <w:r>
-        <w:rPr>
-          <w:noProof/>
-        </w:rPr>
-        <w:t>1</w:t>
-      </w:r>
-      <w:r>
-        <w:fldChar w:fldCharType="end"/>
-      </w:r>
+      <w:fldSimple w:instr=" SEQ Screenshot \* ARABIC ">
+        <w:r>
+          <w:rPr>
+            <w:noProof/>
+          </w:rPr>
+          <w:t>1</w:t>
+        </w:r>
+      </w:fldSimple>
       <w:r>
         <w:t xml:space="preserve">. </w:t>
       </w:r>
@@ -446,24 +436,14 @@
       <w:r>
         <w:t xml:space="preserve">Screenshot </w:t>
       </w:r>
-      <w:r>
-        <w:fldChar w:fldCharType="begin"/>
-      </w:r>
-      <w:r>
-        <w:instrText xml:space="preserve"> SEQ Screenshot \* ARABIC </w:instrText>
-      </w:r>
-      <w:r>
-        <w:fldChar w:fldCharType="separate"/>
-      </w:r>
-      <w:r>
-        <w:rPr>
-          <w:noProof/>
-        </w:rPr>
-        <w:t>2</w:t>
-      </w:r>
-      <w:r>
-        <w:fldChar w:fldCharType="end"/>
-      </w:r>
+      <w:fldSimple w:instr=" SEQ Screenshot \* ARABIC ">
+        <w:r>
+          <w:rPr>
+            <w:noProof/>
+          </w:rPr>
+          <w:t>2</w:t>
+        </w:r>
+      </w:fldSimple>
       <w:r>
         <w:t xml:space="preserve">. Products cost by </w:t>
       </w:r>
@@ -627,24 +607,14 @@
       <w:r>
         <w:t xml:space="preserve">Screenshot </w:t>
       </w:r>
-      <w:r>
-        <w:fldChar w:fldCharType="begin"/>
-      </w:r>
-      <w:r>
-        <w:instrText xml:space="preserve"> SEQ Screenshot \* ARABIC </w:instrText>
-      </w:r>
-      <w:r>
-        <w:fldChar w:fldCharType="separate"/>
-      </w:r>
-      <w:r>
-        <w:rPr>
-          <w:noProof/>
-        </w:rPr>
-        <w:t>3</w:t>
-      </w:r>
-      <w:r>
-        <w:fldChar w:fldCharType="end"/>
-      </w:r>
+      <w:fldSimple w:instr=" SEQ Screenshot \* ARABIC ">
+        <w:r>
+          <w:rPr>
+            <w:noProof/>
+          </w:rPr>
+          <w:t>3</w:t>
+        </w:r>
+      </w:fldSimple>
       <w:r>
         <w:t xml:space="preserve">. </w:t>
       </w:r>
@@ -709,24 +679,14 @@
       <w:r>
         <w:t xml:space="preserve">Screenshot </w:t>
       </w:r>
-      <w:r>
-        <w:fldChar w:fldCharType="begin"/>
-      </w:r>
-      <w:r>
-        <w:instrText xml:space="preserve"> SEQ Screenshot \* ARABIC </w:instrText>
-      </w:r>
-      <w:r>
-        <w:fldChar w:fldCharType="separate"/>
-      </w:r>
-      <w:r>
-        <w:rPr>
-          <w:noProof/>
-        </w:rPr>
-        <w:t>4</w:t>
-      </w:r>
-      <w:r>
-        <w:fldChar w:fldCharType="end"/>
-      </w:r>
+      <w:fldSimple w:instr=" SEQ Screenshot \* ARABIC ">
+        <w:r>
+          <w:rPr>
+            <w:noProof/>
+          </w:rPr>
+          <w:t>4</w:t>
+        </w:r>
+      </w:fldSimple>
       <w:r>
         <w:t xml:space="preserve">. Sorting by new </w:t>
       </w:r>
@@ -792,24 +752,14 @@
       <w:r>
         <w:t xml:space="preserve">Screenshot </w:t>
       </w:r>
-      <w:r>
-        <w:fldChar w:fldCharType="begin"/>
-      </w:r>
-      <w:r>
-        <w:instrText xml:space="preserve"> SEQ Screenshot \* ARABIC </w:instrText>
-      </w:r>
-      <w:r>
-        <w:fldChar w:fldCharType="separate"/>
-      </w:r>
-      <w:r>
-        <w:rPr>
-          <w:noProof/>
-        </w:rPr>
-        <w:t>5</w:t>
-      </w:r>
-      <w:r>
-        <w:fldChar w:fldCharType="end"/>
-      </w:r>
+      <w:fldSimple w:instr=" SEQ Screenshot \* ARABIC ">
+        <w:r>
+          <w:rPr>
+            <w:noProof/>
+          </w:rPr>
+          <w:t>5</w:t>
+        </w:r>
+      </w:fldSimple>
       <w:r>
         <w:t>. Historically sorted Line Chart</w:t>
       </w:r>
@@ -927,24 +877,14 @@
       <w:r>
         <w:t xml:space="preserve">Screenshot </w:t>
       </w:r>
-      <w:r>
-        <w:fldChar w:fldCharType="begin"/>
-      </w:r>
-      <w:r>
-        <w:instrText xml:space="preserve"> SEQ Screenshot \* ARABIC </w:instrText>
-      </w:r>
-      <w:r>
-        <w:fldChar w:fldCharType="separate"/>
-      </w:r>
-      <w:r>
-        <w:rPr>
-          <w:noProof/>
-        </w:rPr>
-        <w:t>6</w:t>
-      </w:r>
-      <w:r>
-        <w:fldChar w:fldCharType="end"/>
-      </w:r>
+      <w:fldSimple w:instr=" SEQ Screenshot \* ARABIC ">
+        <w:r>
+          <w:rPr>
+            <w:noProof/>
+          </w:rPr>
+          <w:t>6</w:t>
+        </w:r>
+      </w:fldSimple>
       <w:r>
         <w:t xml:space="preserve">. </w:t>
       </w:r>
@@ -982,11 +922,13 @@
         <w:keepNext/>
         <w:rPr>
           <w:rFonts w:ascii="Consolas" w:hAnsi="Consolas" w:cs="Courier New"/>
-        </w:rPr>
-      </w:pPr>
-      <w:r>
-        <w:rPr>
-          <w:rFonts w:ascii="Consolas" w:hAnsi="Consolas" w:cs="Courier New"/>
+          <w:lang w:val="pt-PT"/>
+        </w:rPr>
+      </w:pPr>
+      <w:r>
+        <w:rPr>
+          <w:rFonts w:ascii="Consolas" w:hAnsi="Consolas" w:cs="Courier New"/>
+          <w:lang w:val="pt-PT"/>
         </w:rPr>
         <w:t>Order Quantity = SUM('FactInternetSales'[OrderQuantity])</w:t>
       </w:r>
@@ -1046,24 +988,14 @@
       <w:r>
         <w:t xml:space="preserve">Screenshot </w:t>
       </w:r>
-      <w:r>
-        <w:fldChar w:fldCharType="begin"/>
-      </w:r>
-      <w:r>
-        <w:instrText xml:space="preserve"> SEQ Screenshot \* ARABIC </w:instrText>
-      </w:r>
-      <w:r>
-        <w:fldChar w:fldCharType="separate"/>
-      </w:r>
-      <w:r>
-        <w:rPr>
-          <w:noProof/>
-        </w:rPr>
-        <w:t>7</w:t>
-      </w:r>
-      <w:r>
-        <w:fldChar w:fldCharType="end"/>
-      </w:r>
+      <w:fldSimple w:instr=" SEQ Screenshot \* ARABIC ">
+        <w:r>
+          <w:rPr>
+            <w:noProof/>
+          </w:rPr>
+          <w:t>7</w:t>
+        </w:r>
+      </w:fldSimple>
       <w:r>
         <w:t>. Added a new measure</w:t>
       </w:r>
@@ -1086,7 +1018,6 @@
     </w:p>
     <w:p>
       <w:pPr>
-        <w:keepNext/>
         <w:rPr>
           <w:rFonts w:ascii="Consolas" w:hAnsi="Consolas" w:cs="Courier New"/>
         </w:rPr>
@@ -1123,21 +1054,7 @@
         <w:rPr>
           <w:rFonts w:ascii="Consolas" w:hAnsi="Consolas" w:cs="Courier New"/>
         </w:rPr>
-        <w:t>'[</w:t>
-      </w:r>
-      <w:proofErr w:type="spellStart"/>
-      <w:r>
-        <w:rPr>
-          <w:rFonts w:ascii="Consolas" w:hAnsi="Consolas" w:cs="Courier New"/>
-        </w:rPr>
-        <w:t>FullDateAlternateKey</w:t>
-      </w:r>
-      <w:proofErr w:type="spellEnd"/>
-      <w:r>
-        <w:rPr>
-          <w:rFonts w:ascii="Consolas" w:hAnsi="Consolas" w:cs="Courier New"/>
-        </w:rPr>
-        <w:t>])</w:t>
+        <w:t>'[Date])</w:t>
       </w:r>
     </w:p>
     <w:p>
@@ -1197,24 +1114,14 @@
       <w:r>
         <w:t xml:space="preserve">Screenshot </w:t>
       </w:r>
-      <w:r>
-        <w:fldChar w:fldCharType="begin"/>
-      </w:r>
-      <w:r>
-        <w:instrText xml:space="preserve"> SEQ Screenshot \* ARABIC </w:instrText>
-      </w:r>
-      <w:r>
-        <w:fldChar w:fldCharType="separate"/>
-      </w:r>
-      <w:r>
-        <w:rPr>
-          <w:noProof/>
-        </w:rPr>
-        <w:t>8</w:t>
-      </w:r>
-      <w:r>
-        <w:fldChar w:fldCharType="end"/>
-      </w:r>
+      <w:fldSimple w:instr=" SEQ Screenshot \* ARABIC ">
+        <w:r>
+          <w:rPr>
+            <w:noProof/>
+          </w:rPr>
+          <w:t>8</w:t>
+        </w:r>
+      </w:fldSimple>
       <w:r>
         <w:t xml:space="preserve">. </w:t>
       </w:r>
@@ -1232,7 +1139,6 @@
     </w:p>
     <w:p>
       <w:pPr>
-        <w:keepNext/>
         <w:rPr>
           <w:rFonts w:ascii="Consolas" w:hAnsi="Consolas" w:cs="Courier New"/>
         </w:rPr>
@@ -1255,7 +1161,7 @@
         <w:rPr>
           <w:rFonts w:ascii="Consolas" w:hAnsi="Consolas" w:cs="Courier New"/>
         </w:rPr>
-        <w:t>[Order Quantity YTD], DATEADD('</w:t>
+        <w:t>[Order Quantity YTD], SAMEPERIODLASTYEAR('</w:t>
       </w:r>
       <w:proofErr w:type="spellStart"/>
       <w:r>
@@ -1269,21 +1175,7 @@
         <w:rPr>
           <w:rFonts w:ascii="Consolas" w:hAnsi="Consolas" w:cs="Courier New"/>
         </w:rPr>
-        <w:t>'[</w:t>
-      </w:r>
-      <w:proofErr w:type="spellStart"/>
-      <w:r>
-        <w:rPr>
-          <w:rFonts w:ascii="Consolas" w:hAnsi="Consolas" w:cs="Courier New"/>
-        </w:rPr>
-        <w:t>FullDateAlternateKey</w:t>
-      </w:r>
-      <w:proofErr w:type="spellEnd"/>
-      <w:r>
-        <w:rPr>
-          <w:rFonts w:ascii="Consolas" w:hAnsi="Consolas" w:cs="Courier New"/>
-        </w:rPr>
-        <w:t>], -1, YEAR))</w:t>
+        <w:t>'[Date]))</w:t>
       </w:r>
     </w:p>
     <w:p>
@@ -1346,24 +1238,14 @@
       <w:r>
         <w:t xml:space="preserve">Screenshot </w:t>
       </w:r>
-      <w:r>
-        <w:fldChar w:fldCharType="begin"/>
-      </w:r>
-      <w:r>
-        <w:instrText xml:space="preserve"> SEQ Screenshot \* ARABIC </w:instrText>
-      </w:r>
-      <w:r>
-        <w:fldChar w:fldCharType="separate"/>
-      </w:r>
-      <w:r>
-        <w:rPr>
-          <w:noProof/>
-        </w:rPr>
-        <w:t>9</w:t>
-      </w:r>
-      <w:r>
-        <w:fldChar w:fldCharType="end"/>
-      </w:r>
+      <w:fldSimple w:instr=" SEQ Screenshot \* ARABIC ">
+        <w:r>
+          <w:rPr>
+            <w:noProof/>
+          </w:rPr>
+          <w:t>9</w:t>
+        </w:r>
+      </w:fldSimple>
       <w:r>
         <w:t xml:space="preserve">. </w:t>
       </w:r>
@@ -1380,6 +1262,7 @@
         <w:pStyle w:val="Heading2"/>
       </w:pPr>
       <w:r>
+        <w:lastRenderedPageBreak/>
         <w:t>1.6 Verification Table</w:t>
       </w:r>
     </w:p>
@@ -1437,24 +1320,14 @@
       <w:r>
         <w:t xml:space="preserve">Screenshot </w:t>
       </w:r>
-      <w:r>
-        <w:fldChar w:fldCharType="begin"/>
-      </w:r>
-      <w:r>
-        <w:instrText xml:space="preserve"> SEQ Screenshot \* ARABIC </w:instrText>
-      </w:r>
-      <w:r>
-        <w:fldChar w:fldCharType="separate"/>
-      </w:r>
-      <w:r>
-        <w:rPr>
-          <w:noProof/>
-        </w:rPr>
-        <w:t>10</w:t>
-      </w:r>
-      <w:r>
-        <w:fldChar w:fldCharType="end"/>
-      </w:r>
+      <w:fldSimple w:instr=" SEQ Screenshot \* ARABIC ">
+        <w:r>
+          <w:rPr>
+            <w:noProof/>
+          </w:rPr>
+          <w:t>10</w:t>
+        </w:r>
+      </w:fldSimple>
       <w:r>
         <w:t>. Table with all the measures</w:t>
       </w:r>
@@ -1566,14 +1439,12 @@
         </w:rPr>
         <w:t>'[</w:t>
       </w:r>
-      <w:proofErr w:type="spellStart"/>
-      <w:r>
-        <w:rPr>
-          <w:rFonts w:ascii="Consolas" w:hAnsi="Consolas" w:cs="Courier New"/>
-        </w:rPr>
-        <w:t>FullDateAlternateKey</w:t>
-      </w:r>
-      <w:proofErr w:type="spellEnd"/>
+      <w:r>
+        <w:rPr>
+          <w:rFonts w:ascii="Consolas" w:hAnsi="Consolas" w:cs="Courier New"/>
+        </w:rPr>
+        <w:t>Date</w:t>
+      </w:r>
       <w:r>
         <w:rPr>
           <w:rFonts w:ascii="Consolas" w:hAnsi="Consolas" w:cs="Courier New"/>
@@ -1627,14 +1498,12 @@
         </w:rPr>
         <w:t>'[</w:t>
       </w:r>
-      <w:proofErr w:type="spellStart"/>
-      <w:r>
-        <w:rPr>
-          <w:rFonts w:ascii="Consolas" w:hAnsi="Consolas" w:cs="Courier New"/>
-        </w:rPr>
-        <w:t>FullDateAlternateKey</w:t>
-      </w:r>
-      <w:proofErr w:type="spellEnd"/>
+      <w:r>
+        <w:rPr>
+          <w:rFonts w:ascii="Consolas" w:hAnsi="Consolas" w:cs="Courier New"/>
+        </w:rPr>
+        <w:t>Date</w:t>
+      </w:r>
       <w:r>
         <w:rPr>
           <w:rFonts w:ascii="Consolas" w:hAnsi="Consolas" w:cs="Courier New"/>
@@ -1700,24 +1569,14 @@
       <w:r>
         <w:t xml:space="preserve">Screenshot </w:t>
       </w:r>
-      <w:r>
-        <w:fldChar w:fldCharType="begin"/>
-      </w:r>
-      <w:r>
-        <w:instrText xml:space="preserve"> SEQ Screenshot \* ARABIC </w:instrText>
-      </w:r>
-      <w:r>
-        <w:fldChar w:fldCharType="separate"/>
-      </w:r>
-      <w:r>
-        <w:rPr>
-          <w:noProof/>
-        </w:rPr>
-        <w:t>11</w:t>
-      </w:r>
-      <w:r>
-        <w:fldChar w:fldCharType="end"/>
-      </w:r>
+      <w:fldSimple w:instr=" SEQ Screenshot \* ARABIC ">
+        <w:r>
+          <w:rPr>
+            <w:noProof/>
+          </w:rPr>
+          <w:t>11</w:t>
+        </w:r>
+      </w:fldSimple>
       <w:r>
         <w:t>. Created Sales Amount measure</w:t>
       </w:r>
@@ -1775,24 +1634,14 @@
       <w:r>
         <w:t xml:space="preserve">Screenshot </w:t>
       </w:r>
-      <w:r>
-        <w:fldChar w:fldCharType="begin"/>
-      </w:r>
-      <w:r>
-        <w:instrText xml:space="preserve"> SEQ Screenshot \* ARABIC </w:instrText>
-      </w:r>
-      <w:r>
-        <w:fldChar w:fldCharType="separate"/>
-      </w:r>
-      <w:r>
-        <w:rPr>
-          <w:noProof/>
-        </w:rPr>
-        <w:t>12</w:t>
-      </w:r>
-      <w:r>
-        <w:fldChar w:fldCharType="end"/>
-      </w:r>
+      <w:fldSimple w:instr=" SEQ Screenshot \* ARABIC ">
+        <w:r>
+          <w:rPr>
+            <w:noProof/>
+          </w:rPr>
+          <w:t>12</w:t>
+        </w:r>
+      </w:fldSimple>
       <w:r>
         <w:t xml:space="preserve">. Created Sales Amount </w:t>
       </w:r>
@@ -1856,24 +1705,14 @@
       <w:r>
         <w:t xml:space="preserve">Screenshot </w:t>
       </w:r>
-      <w:r>
-        <w:fldChar w:fldCharType="begin"/>
-      </w:r>
-      <w:r>
-        <w:instrText xml:space="preserve"> SEQ Screenshot \* ARABIC </w:instrText>
-      </w:r>
-      <w:r>
-        <w:fldChar w:fldCharType="separate"/>
-      </w:r>
-      <w:r>
-        <w:rPr>
-          <w:noProof/>
-        </w:rPr>
-        <w:t>13</w:t>
-      </w:r>
-      <w:r>
-        <w:fldChar w:fldCharType="end"/>
-      </w:r>
+      <w:fldSimple w:instr=" SEQ Screenshot \* ARABIC ">
+        <w:r>
+          <w:rPr>
+            <w:noProof/>
+          </w:rPr>
+          <w:t>13</w:t>
+        </w:r>
+      </w:fldSimple>
       <w:r>
         <w:t xml:space="preserve">. </w:t>
       </w:r>
@@ -2001,24 +1840,14 @@
       <w:r>
         <w:t xml:space="preserve">Screenshot </w:t>
       </w:r>
-      <w:r>
-        <w:fldChar w:fldCharType="begin"/>
-      </w:r>
-      <w:r>
-        <w:instrText xml:space="preserve"> SEQ Screenshot \* ARABIC </w:instrText>
-      </w:r>
-      <w:r>
-        <w:fldChar w:fldCharType="separate"/>
-      </w:r>
-      <w:r>
-        <w:rPr>
-          <w:noProof/>
-        </w:rPr>
-        <w:t>14</w:t>
-      </w:r>
-      <w:r>
-        <w:fldChar w:fldCharType="end"/>
-      </w:r>
+      <w:fldSimple w:instr=" SEQ Screenshot \* ARABIC ">
+        <w:r>
+          <w:rPr>
+            <w:noProof/>
+          </w:rPr>
+          <w:t>14</w:t>
+        </w:r>
+      </w:fldSimple>
       <w:r>
         <w:t>. Added Current User measure</w:t>
       </w:r>
@@ -2077,24 +1906,14 @@
       <w:r>
         <w:t xml:space="preserve">Screenshot </w:t>
       </w:r>
-      <w:r>
-        <w:fldChar w:fldCharType="begin"/>
-      </w:r>
-      <w:r>
-        <w:instrText xml:space="preserve"> SEQ Screenshot \* ARABIC </w:instrText>
-      </w:r>
-      <w:r>
-        <w:fldChar w:fldCharType="separate"/>
-      </w:r>
-      <w:r>
-        <w:rPr>
-          <w:noProof/>
-        </w:rPr>
-        <w:t>15</w:t>
-      </w:r>
-      <w:r>
-        <w:fldChar w:fldCharType="end"/>
-      </w:r>
+      <w:fldSimple w:instr=" SEQ Screenshot \* ARABIC ">
+        <w:r>
+          <w:rPr>
+            <w:noProof/>
+          </w:rPr>
+          <w:t>15</w:t>
+        </w:r>
+      </w:fldSimple>
       <w:r>
         <w:t>. Current User Card</w:t>
       </w:r>
@@ -2152,24 +1971,14 @@
       <w:r>
         <w:t xml:space="preserve">Screenshot </w:t>
       </w:r>
-      <w:r>
-        <w:fldChar w:fldCharType="begin"/>
-      </w:r>
-      <w:r>
-        <w:instrText xml:space="preserve"> SEQ Screenshot \* ARABIC </w:instrText>
-      </w:r>
-      <w:r>
-        <w:fldChar w:fldCharType="separate"/>
-      </w:r>
-      <w:r>
-        <w:rPr>
-          <w:noProof/>
-        </w:rPr>
-        <w:t>16</w:t>
-      </w:r>
-      <w:r>
-        <w:fldChar w:fldCharType="end"/>
-      </w:r>
+      <w:fldSimple w:instr=" SEQ Screenshot \* ARABIC ">
+        <w:r>
+          <w:rPr>
+            <w:noProof/>
+          </w:rPr>
+          <w:t>16</w:t>
+        </w:r>
+      </w:fldSimple>
       <w:r>
         <w:t>. Username and Current date header</w:t>
       </w:r>
@@ -2274,24 +2083,14 @@
       <w:r>
         <w:t xml:space="preserve">Screenshot </w:t>
       </w:r>
-      <w:r>
-        <w:fldChar w:fldCharType="begin"/>
-      </w:r>
-      <w:r>
-        <w:instrText xml:space="preserve"> SEQ Screenshot \* ARABIC </w:instrText>
-      </w:r>
-      <w:r>
-        <w:fldChar w:fldCharType="separate"/>
-      </w:r>
-      <w:r>
-        <w:rPr>
-          <w:noProof/>
-        </w:rPr>
-        <w:t>17</w:t>
-      </w:r>
-      <w:r>
-        <w:fldChar w:fldCharType="end"/>
-      </w:r>
+      <w:fldSimple w:instr=" SEQ Screenshot \* ARABIC ">
+        <w:r>
+          <w:rPr>
+            <w:noProof/>
+          </w:rPr>
+          <w:t>17</w:t>
+        </w:r>
+      </w:fldSimple>
       <w:r>
         <w:t xml:space="preserve">. </w:t>
       </w:r>
@@ -2352,24 +2151,14 @@
       <w:r>
         <w:t xml:space="preserve">Screenshot </w:t>
       </w:r>
-      <w:r>
-        <w:fldChar w:fldCharType="begin"/>
-      </w:r>
-      <w:r>
-        <w:instrText xml:space="preserve"> SEQ Screenshot \* ARABIC </w:instrText>
-      </w:r>
-      <w:r>
-        <w:fldChar w:fldCharType="separate"/>
-      </w:r>
-      <w:r>
-        <w:rPr>
-          <w:noProof/>
-        </w:rPr>
-        <w:t>18</w:t>
-      </w:r>
-      <w:r>
-        <w:fldChar w:fldCharType="end"/>
-      </w:r>
+      <w:fldSimple w:instr=" SEQ Screenshot \* ARABIC ">
+        <w:r>
+          <w:rPr>
+            <w:noProof/>
+          </w:rPr>
+          <w:t>18</w:t>
+        </w:r>
+      </w:fldSimple>
       <w:r>
         <w:t xml:space="preserve">. </w:t>
       </w:r>
@@ -2392,9 +2181,10 @@
       </w:r>
     </w:p>
     <w:p/>
-    <w:p>
-      <w:pPr>
-        <w:keepNext/>
+    <w:p/>
+    <w:p>
+      <w:pPr>
+        <w:spacing w:after="0" w:line="240" w:lineRule="auto"/>
         <w:rPr>
           <w:rFonts w:ascii="Consolas" w:hAnsi="Consolas" w:cs="Courier New"/>
         </w:rPr>
@@ -2406,6 +2196,14 @@
         <w:lastRenderedPageBreak/>
         <w:t xml:space="preserve">Qty % of Month = </w:t>
       </w:r>
+    </w:p>
+    <w:p>
+      <w:pPr>
+        <w:spacing w:after="0" w:line="240" w:lineRule="auto"/>
+        <w:rPr>
+          <w:rFonts w:ascii="Consolas" w:hAnsi="Consolas" w:cs="Courier New"/>
+        </w:rPr>
+      </w:pPr>
       <w:proofErr w:type="gramStart"/>
       <w:r>
         <w:rPr>
@@ -2414,11 +2212,33 @@
         <w:t>DIVIDE(</w:t>
       </w:r>
       <w:proofErr w:type="gramEnd"/>
-      <w:r>
-        <w:rPr>
-          <w:rFonts w:ascii="Consolas" w:hAnsi="Consolas" w:cs="Courier New"/>
-        </w:rPr>
-        <w:t xml:space="preserve">[Order Quantity], </w:t>
+    </w:p>
+    <w:p>
+      <w:pPr>
+        <w:spacing w:after="0" w:line="240" w:lineRule="auto"/>
+        <w:rPr>
+          <w:rFonts w:ascii="Consolas" w:hAnsi="Consolas" w:cs="Courier New"/>
+        </w:rPr>
+      </w:pPr>
+      <w:r>
+        <w:rPr>
+          <w:rFonts w:ascii="Consolas" w:hAnsi="Consolas" w:cs="Courier New"/>
+        </w:rPr>
+        <w:t xml:space="preserve">    [Order Quantity], </w:t>
+      </w:r>
+    </w:p>
+    <w:p>
+      <w:pPr>
+        <w:spacing w:after="0" w:line="240" w:lineRule="auto"/>
+        <w:rPr>
+          <w:rFonts w:ascii="Consolas" w:hAnsi="Consolas" w:cs="Courier New"/>
+        </w:rPr>
+      </w:pPr>
+      <w:r>
+        <w:rPr>
+          <w:rFonts w:ascii="Consolas" w:hAnsi="Consolas" w:cs="Courier New"/>
+        </w:rPr>
+        <w:t xml:space="preserve">    </w:t>
       </w:r>
       <w:proofErr w:type="gramStart"/>
       <w:r>
@@ -2428,11 +2248,47 @@
         <w:t>CALCULATE(</w:t>
       </w:r>
       <w:proofErr w:type="gramEnd"/>
-      <w:r>
-        <w:rPr>
-          <w:rFonts w:ascii="Consolas" w:hAnsi="Consolas" w:cs="Courier New"/>
-        </w:rPr>
-        <w:t>[Order Quantity], ALL('</w:t>
+    </w:p>
+    <w:p>
+      <w:pPr>
+        <w:spacing w:after="0" w:line="240" w:lineRule="auto"/>
+        <w:rPr>
+          <w:rFonts w:ascii="Consolas" w:hAnsi="Consolas" w:cs="Courier New"/>
+        </w:rPr>
+      </w:pPr>
+      <w:r>
+        <w:rPr>
+          <w:rFonts w:ascii="Consolas" w:hAnsi="Consolas" w:cs="Courier New"/>
+        </w:rPr>
+        <w:t xml:space="preserve">        [Order Quantity], </w:t>
+      </w:r>
+    </w:p>
+    <w:p>
+      <w:pPr>
+        <w:spacing w:after="0" w:line="240" w:lineRule="auto"/>
+        <w:rPr>
+          <w:rFonts w:ascii="Consolas" w:hAnsi="Consolas" w:cs="Courier New"/>
+        </w:rPr>
+      </w:pPr>
+      <w:r>
+        <w:rPr>
+          <w:rFonts w:ascii="Consolas" w:hAnsi="Consolas" w:cs="Courier New"/>
+        </w:rPr>
+        <w:t xml:space="preserve">        </w:t>
+      </w:r>
+      <w:proofErr w:type="gramStart"/>
+      <w:r>
+        <w:rPr>
+          <w:rFonts w:ascii="Consolas" w:hAnsi="Consolas" w:cs="Courier New"/>
+        </w:rPr>
+        <w:t>ALLEXCEPT(</w:t>
+      </w:r>
+      <w:proofErr w:type="gramEnd"/>
+      <w:r>
+        <w:rPr>
+          <w:rFonts w:ascii="Consolas" w:hAnsi="Consolas" w:cs="Courier New"/>
+        </w:rPr>
+        <w:t>'</w:t>
       </w:r>
       <w:proofErr w:type="spellStart"/>
       <w:r>
@@ -2446,7 +2302,116 @@
         <w:rPr>
           <w:rFonts w:ascii="Consolas" w:hAnsi="Consolas" w:cs="Courier New"/>
         </w:rPr>
-        <w:t>')))</w:t>
+        <w:t>', '</w:t>
+      </w:r>
+      <w:proofErr w:type="spellStart"/>
+      <w:r>
+        <w:rPr>
+          <w:rFonts w:ascii="Consolas" w:hAnsi="Consolas" w:cs="Courier New"/>
+        </w:rPr>
+        <w:t>DimProduct</w:t>
+      </w:r>
+      <w:proofErr w:type="spellEnd"/>
+      <w:r>
+        <w:rPr>
+          <w:rFonts w:ascii="Consolas" w:hAnsi="Consolas" w:cs="Courier New"/>
+        </w:rPr>
+        <w:t>'[Color]),</w:t>
+      </w:r>
+    </w:p>
+    <w:p>
+      <w:pPr>
+        <w:spacing w:after="0" w:line="240" w:lineRule="auto"/>
+        <w:rPr>
+          <w:rFonts w:ascii="Consolas" w:hAnsi="Consolas" w:cs="Courier New"/>
+        </w:rPr>
+      </w:pPr>
+      <w:r>
+        <w:rPr>
+          <w:rFonts w:ascii="Consolas" w:hAnsi="Consolas" w:cs="Courier New"/>
+        </w:rPr>
+        <w:t xml:space="preserve">        </w:t>
+      </w:r>
+      <w:proofErr w:type="gramStart"/>
+      <w:r>
+        <w:rPr>
+          <w:rFonts w:ascii="Consolas" w:hAnsi="Consolas" w:cs="Courier New"/>
+        </w:rPr>
+        <w:t>ALLEXCEPT(</w:t>
+      </w:r>
+      <w:proofErr w:type="gramEnd"/>
+      <w:r>
+        <w:rPr>
+          <w:rFonts w:ascii="Consolas" w:hAnsi="Consolas" w:cs="Courier New"/>
+        </w:rPr>
+        <w:t>'</w:t>
+      </w:r>
+      <w:proofErr w:type="spellStart"/>
+      <w:r>
+        <w:rPr>
+          <w:rFonts w:ascii="Consolas" w:hAnsi="Consolas" w:cs="Courier New"/>
+        </w:rPr>
+        <w:t>DimDate</w:t>
+      </w:r>
+      <w:proofErr w:type="spellEnd"/>
+      <w:r>
+        <w:rPr>
+          <w:rFonts w:ascii="Consolas" w:hAnsi="Consolas" w:cs="Courier New"/>
+        </w:rPr>
+        <w:t>', '</w:t>
+      </w:r>
+      <w:proofErr w:type="spellStart"/>
+      <w:r>
+        <w:rPr>
+          <w:rFonts w:ascii="Consolas" w:hAnsi="Consolas" w:cs="Courier New"/>
+        </w:rPr>
+        <w:t>DimDate</w:t>
+      </w:r>
+      <w:proofErr w:type="spellEnd"/>
+      <w:r>
+        <w:rPr>
+          <w:rFonts w:ascii="Consolas" w:hAnsi="Consolas" w:cs="Courier New"/>
+        </w:rPr>
+        <w:t>'[</w:t>
+      </w:r>
+      <w:proofErr w:type="spellStart"/>
+      <w:r>
+        <w:rPr>
+          <w:rFonts w:ascii="Consolas" w:hAnsi="Consolas" w:cs="Courier New"/>
+        </w:rPr>
+        <w:t>YearMonthLabel</w:t>
+      </w:r>
+      <w:proofErr w:type="spellEnd"/>
+      <w:r>
+        <w:rPr>
+          <w:rFonts w:ascii="Consolas" w:hAnsi="Consolas" w:cs="Courier New"/>
+        </w:rPr>
+        <w:t>])</w:t>
+      </w:r>
+    </w:p>
+    <w:p>
+      <w:pPr>
+        <w:spacing w:after="0" w:line="240" w:lineRule="auto"/>
+        <w:rPr>
+          <w:rFonts w:ascii="Consolas" w:hAnsi="Consolas" w:cs="Courier New"/>
+        </w:rPr>
+      </w:pPr>
+      <w:r>
+        <w:rPr>
+          <w:rFonts w:ascii="Consolas" w:hAnsi="Consolas" w:cs="Courier New"/>
+        </w:rPr>
+        <w:t xml:space="preserve">    )</w:t>
+      </w:r>
+    </w:p>
+    <w:p>
+      <w:pPr>
+        <w:spacing w:after="0" w:line="240" w:lineRule="auto"/>
+      </w:pPr>
+      <w:r>
+        <w:rPr>
+          <w:rFonts w:ascii="Consolas" w:hAnsi="Consolas" w:cs="Courier New"/>
+        </w:rPr>
+        <w:t>)</w:t>
       </w:r>
     </w:p>
     <w:p>
@@ -2514,24 +2479,14 @@
       <w:r>
         <w:t xml:space="preserve">Screenshot </w:t>
       </w:r>
-      <w:r>
-        <w:fldChar w:fldCharType="begin"/>
-      </w:r>
-      <w:r>
-        <w:instrText xml:space="preserve"> SEQ Screenshot \* ARABIC </w:instrText>
-      </w:r>
-      <w:r>
-        <w:fldChar w:fldCharType="separate"/>
-      </w:r>
-      <w:r>
-        <w:rPr>
-          <w:noProof/>
-        </w:rPr>
-        <w:t>19</w:t>
-      </w:r>
-      <w:r>
-        <w:fldChar w:fldCharType="end"/>
-      </w:r>
+      <w:fldSimple w:instr=" SEQ Screenshot \* ARABIC ">
+        <w:r>
+          <w:rPr>
+            <w:noProof/>
+          </w:rPr>
+          <w:t>19</w:t>
+        </w:r>
+      </w:fldSimple>
       <w:r>
         <w:t>. Table with Product Details</w:t>
       </w:r>
@@ -2674,6 +2629,7 @@
           <w:noProof/>
           <w:lang w:val="ru-RU"/>
         </w:rPr>
+        <w:lastRenderedPageBreak/>
         <w:drawing>
           <wp:inline distT="0" distB="0" distL="0" distR="0" wp14:anchorId="6C8ACBAB" wp14:editId="71B464FE">
             <wp:extent cx="5943600" cy="435610"/>
@@ -2718,46 +2674,35 @@
       <w:r>
         <w:t xml:space="preserve">Screenshot </w:t>
       </w:r>
-      <w:r>
-        <w:fldChar w:fldCharType="begin"/>
-      </w:r>
-      <w:r>
-        <w:instrText xml:space="preserve"> SEQ Screenshot \* ARABIC </w:instrText>
-      </w:r>
-      <w:r>
-        <w:fldChar w:fldCharType="separate"/>
-      </w:r>
+      <w:fldSimple w:instr=" SEQ Screenshot \* ARABIC ">
+        <w:r>
+          <w:rPr>
+            <w:noProof/>
+          </w:rPr>
+          <w:t>20</w:t>
+        </w:r>
+      </w:fldSimple>
+      <w:r>
+        <w:t xml:space="preserve">. Measure to show </w:t>
+      </w:r>
+      <w:r>
+        <w:t xml:space="preserve">Sales Amount for Maximum </w:t>
+      </w:r>
+      <w:proofErr w:type="spellStart"/>
+      <w:r>
+        <w:t>OrderDate</w:t>
+      </w:r>
+      <w:proofErr w:type="spellEnd"/>
+    </w:p>
+    <w:p/>
+    <w:p>
+      <w:pPr>
+        <w:keepNext/>
+      </w:pPr>
       <w:r>
         <w:rPr>
           <w:noProof/>
         </w:rPr>
-        <w:t>20</w:t>
-      </w:r>
-      <w:r>
-        <w:fldChar w:fldCharType="end"/>
-      </w:r>
-      <w:r>
-        <w:t xml:space="preserve">. Measure to show </w:t>
-      </w:r>
-      <w:r>
-        <w:t xml:space="preserve">Sales Amount for Maximum </w:t>
-      </w:r>
-      <w:proofErr w:type="spellStart"/>
-      <w:r>
-        <w:t>OrderDate</w:t>
-      </w:r>
-      <w:proofErr w:type="spellEnd"/>
-    </w:p>
-    <w:p/>
-    <w:p>
-      <w:pPr>
-        <w:keepNext/>
-      </w:pPr>
-      <w:r>
-        <w:rPr>
-          <w:noProof/>
-        </w:rPr>
-        <w:lastRenderedPageBreak/>
         <w:drawing>
           <wp:inline distT="0" distB="0" distL="0" distR="0" wp14:anchorId="279D9F52" wp14:editId="11BB52EE">
             <wp:extent cx="5943600" cy="2498090"/>
@@ -2802,24 +2747,14 @@
       <w:r>
         <w:t xml:space="preserve">Screenshot </w:t>
       </w:r>
-      <w:r>
-        <w:fldChar w:fldCharType="begin"/>
-      </w:r>
-      <w:r>
-        <w:instrText xml:space="preserve"> SEQ Screenshot \* ARABIC </w:instrText>
-      </w:r>
-      <w:r>
-        <w:fldChar w:fldCharType="separate"/>
-      </w:r>
-      <w:r>
-        <w:rPr>
-          <w:noProof/>
-        </w:rPr>
-        <w:t>21</w:t>
-      </w:r>
-      <w:r>
-        <w:fldChar w:fldCharType="end"/>
-      </w:r>
+      <w:fldSimple w:instr=" SEQ Screenshot \* ARABIC ">
+        <w:r>
+          <w:rPr>
+            <w:noProof/>
+          </w:rPr>
+          <w:t>21</w:t>
+        </w:r>
+      </w:fldSimple>
       <w:r>
         <w:t>. Card for the new measure</w:t>
       </w:r>
@@ -2842,105 +2777,82 @@
     </w:p>
     <w:p>
       <w:pPr>
+        <w:rPr>
+          <w:rFonts w:ascii="Consolas" w:hAnsi="Consolas" w:cs="Courier New"/>
+        </w:rPr>
+      </w:pPr>
+      <w:r>
+        <w:rPr>
+          <w:rFonts w:ascii="Consolas" w:hAnsi="Consolas" w:cs="Courier New"/>
+        </w:rPr>
+        <w:t xml:space="preserve">Top Sales Country = </w:t>
+      </w:r>
+      <w:proofErr w:type="gramStart"/>
+      <w:r>
+        <w:rPr>
+          <w:rFonts w:ascii="Consolas" w:hAnsi="Consolas" w:cs="Courier New"/>
+        </w:rPr>
+        <w:t>MAXX(TOPN(</w:t>
+      </w:r>
+      <w:proofErr w:type="gramEnd"/>
+      <w:r>
+        <w:rPr>
+          <w:rFonts w:ascii="Consolas" w:hAnsi="Consolas" w:cs="Courier New"/>
+        </w:rPr>
+        <w:t>1, ALL('</w:t>
+      </w:r>
+      <w:proofErr w:type="spellStart"/>
+      <w:r>
+        <w:rPr>
+          <w:rFonts w:ascii="Consolas" w:hAnsi="Consolas" w:cs="Courier New"/>
+        </w:rPr>
+        <w:t>DimSalesTerritory</w:t>
+      </w:r>
+      <w:proofErr w:type="spellEnd"/>
+      <w:r>
+        <w:rPr>
+          <w:rFonts w:ascii="Consolas" w:hAnsi="Consolas" w:cs="Courier New"/>
+        </w:rPr>
+        <w:t>'), [Sales Amount]), '</w:t>
+      </w:r>
+      <w:proofErr w:type="spellStart"/>
+      <w:r>
+        <w:rPr>
+          <w:rFonts w:ascii="Consolas" w:hAnsi="Consolas" w:cs="Courier New"/>
+        </w:rPr>
+        <w:t>DimSalesTerritory</w:t>
+      </w:r>
+      <w:proofErr w:type="spellEnd"/>
+      <w:r>
+        <w:rPr>
+          <w:rFonts w:ascii="Consolas" w:hAnsi="Consolas" w:cs="Courier New"/>
+        </w:rPr>
+        <w:t>'[Country])</w:t>
+      </w:r>
+      <w:r>
+        <w:rPr>
+          <w:rFonts w:ascii="Consolas" w:hAnsi="Consolas" w:cs="Courier New"/>
+        </w:rPr>
+        <w:t xml:space="preserve"> </w:t>
+      </w:r>
+    </w:p>
+    <w:p>
+      <w:r>
+        <w:t>TOPN identifies the single country with the highest sales, and MINX extracts its name as text. This approach returns a readable country name suitable for Card display and updates dynamically if sales patterns shift.</w:t>
+      </w:r>
+    </w:p>
+    <w:p>
+      <w:pPr>
         <w:keepNext/>
-        <w:rPr>
-          <w:rFonts w:ascii="Consolas" w:hAnsi="Consolas" w:cs="Courier New"/>
-        </w:rPr>
-      </w:pPr>
-      <w:r>
-        <w:rPr>
-          <w:rFonts w:ascii="Consolas" w:hAnsi="Consolas" w:cs="Courier New"/>
-        </w:rPr>
-        <w:t xml:space="preserve">Top Sales Country = </w:t>
-      </w:r>
-      <w:proofErr w:type="gramStart"/>
-      <w:r>
-        <w:rPr>
-          <w:rFonts w:ascii="Consolas" w:hAnsi="Consolas" w:cs="Courier New"/>
-        </w:rPr>
-        <w:t>MINX(TOPN(</w:t>
-      </w:r>
-      <w:proofErr w:type="gramEnd"/>
-      <w:r>
-        <w:rPr>
-          <w:rFonts w:ascii="Consolas" w:hAnsi="Consolas" w:cs="Courier New"/>
-        </w:rPr>
-        <w:t>1, VALUES('</w:t>
-      </w:r>
-      <w:proofErr w:type="spellStart"/>
-      <w:r>
-        <w:rPr>
-          <w:rFonts w:ascii="Consolas" w:hAnsi="Consolas" w:cs="Courier New"/>
-        </w:rPr>
-        <w:t>DimGeography</w:t>
-      </w:r>
-      <w:proofErr w:type="spellEnd"/>
-      <w:r>
-        <w:rPr>
-          <w:rFonts w:ascii="Consolas" w:hAnsi="Consolas" w:cs="Courier New"/>
-        </w:rPr>
-        <w:t>'[</w:t>
-      </w:r>
-      <w:proofErr w:type="spellStart"/>
-      <w:r>
-        <w:rPr>
-          <w:rFonts w:ascii="Consolas" w:hAnsi="Consolas" w:cs="Courier New"/>
-        </w:rPr>
-        <w:t>EnglishCountryRegionName</w:t>
-      </w:r>
-      <w:proofErr w:type="spellEnd"/>
-      <w:r>
-        <w:rPr>
-          <w:rFonts w:ascii="Consolas" w:hAnsi="Consolas" w:cs="Courier New"/>
-        </w:rPr>
-        <w:t>]), [Sales Amount]), '</w:t>
-      </w:r>
-      <w:proofErr w:type="spellStart"/>
-      <w:r>
-        <w:rPr>
-          <w:rFonts w:ascii="Consolas" w:hAnsi="Consolas" w:cs="Courier New"/>
-        </w:rPr>
-        <w:t>DimGeography</w:t>
-      </w:r>
-      <w:proofErr w:type="spellEnd"/>
-      <w:r>
-        <w:rPr>
-          <w:rFonts w:ascii="Consolas" w:hAnsi="Consolas" w:cs="Courier New"/>
-        </w:rPr>
-        <w:t>'[</w:t>
-      </w:r>
-      <w:proofErr w:type="spellStart"/>
-      <w:r>
-        <w:rPr>
-          <w:rFonts w:ascii="Consolas" w:hAnsi="Consolas" w:cs="Courier New"/>
-        </w:rPr>
-        <w:t>EnglishCountryRegionName</w:t>
-      </w:r>
-      <w:proofErr w:type="spellEnd"/>
-      <w:r>
-        <w:rPr>
-          <w:rFonts w:ascii="Consolas" w:hAnsi="Consolas" w:cs="Courier New"/>
-        </w:rPr>
-        <w:t>])</w:t>
-      </w:r>
-    </w:p>
-    <w:p>
-      <w:r>
-        <w:t>TOPN identifies the single country with the highest sales, and MINX extracts its name as text. This approach returns a readable country name suitable for Card display and updates dynamically if sales patterns shift.</w:t>
-      </w:r>
-    </w:p>
-    <w:p>
-      <w:pPr>
-        <w:keepNext/>
       </w:pPr>
       <w:r>
         <w:rPr>
           <w:noProof/>
         </w:rPr>
         <w:drawing>
-          <wp:inline distT="0" distB="0" distL="0" distR="0" wp14:anchorId="59E559D8" wp14:editId="77EED670">
-            <wp:extent cx="5943600" cy="328930"/>
-            <wp:effectExtent l="0" t="0" r="0" b="0"/>
+          <wp:inline distT="0" distB="0" distL="0" distR="0" wp14:anchorId="59E559D8" wp14:editId="42602727">
+            <wp:extent cx="4835275" cy="328930"/>
+            <wp:effectExtent l="0" t="0" r="3810" b="0"/>
             <wp:docPr id="1328684811" name="Picture 1"/>
             <wp:cNvGraphicFramePr>
               <a:graphicFrameLocks xmlns:a="http://schemas.openxmlformats.org/drawingml/2006/main" noChangeAspect="1"/>
@@ -2949,11 +2861,17 @@
               <a:graphicData uri="http://schemas.openxmlformats.org/drawingml/2006/picture">
                 <pic:pic xmlns:pic="http://schemas.openxmlformats.org/drawingml/2006/picture">
                   <pic:nvPicPr>
-                    <pic:cNvPr id="1328684811" name=""/>
+                    <pic:cNvPr id="1328684811" name="Picture 1"/>
                     <pic:cNvPicPr/>
                   </pic:nvPicPr>
                   <pic:blipFill>
-                    <a:blip r:embed="rId27"/>
+                    <a:blip r:embed="rId27">
+                      <a:extLst>
+                        <a:ext uri="{28A0092B-C50C-407E-A947-70E740481C1C}">
+                          <a14:useLocalDpi xmlns:a14="http://schemas.microsoft.com/office/drawing/2010/main" val="0"/>
+                        </a:ext>
+                      </a:extLst>
+                    </a:blip>
                     <a:stretch>
                       <a:fillRect/>
                     </a:stretch>
@@ -2961,7 +2879,7 @@
                   <pic:spPr>
                     <a:xfrm>
                       <a:off x="0" y="0"/>
-                      <a:ext cx="5943600" cy="328930"/>
+                      <a:ext cx="4835275" cy="328930"/>
                     </a:xfrm>
                     <a:prstGeom prst="rect">
                       <a:avLst/>
@@ -2981,46 +2899,37 @@
       <w:r>
         <w:t xml:space="preserve">Screenshot </w:t>
       </w:r>
-      <w:r>
-        <w:fldChar w:fldCharType="begin"/>
-      </w:r>
-      <w:r>
-        <w:instrText xml:space="preserve"> SEQ Screenshot \* ARABIC </w:instrText>
-      </w:r>
-      <w:r>
-        <w:fldChar w:fldCharType="separate"/>
-      </w:r>
+      <w:fldSimple w:instr=" SEQ Screenshot \* ARABIC ">
+        <w:r>
+          <w:rPr>
+            <w:noProof/>
+          </w:rPr>
+          <w:t>22</w:t>
+        </w:r>
+      </w:fldSimple>
+      <w:r>
+        <w:t xml:space="preserve">. </w:t>
+      </w:r>
+      <w:r>
+        <w:t xml:space="preserve">Country with </w:t>
+      </w:r>
+      <w:r>
+        <w:t xml:space="preserve">the </w:t>
+      </w:r>
+      <w:r>
+        <w:t>Highest Sales</w:t>
+      </w:r>
+    </w:p>
+    <w:p/>
+    <w:p>
+      <w:pPr>
+        <w:keepNext/>
+      </w:pPr>
       <w:r>
         <w:rPr>
           <w:noProof/>
         </w:rPr>
-        <w:t>22</w:t>
-      </w:r>
-      <w:r>
-        <w:fldChar w:fldCharType="end"/>
-      </w:r>
-      <w:r>
-        <w:t xml:space="preserve">. </w:t>
-      </w:r>
-      <w:r>
-        <w:t xml:space="preserve">Country with </w:t>
-      </w:r>
-      <w:r>
-        <w:t xml:space="preserve">the </w:t>
-      </w:r>
-      <w:r>
-        <w:t>Highest Sales</w:t>
-      </w:r>
-    </w:p>
-    <w:p/>
-    <w:p>
-      <w:pPr>
-        <w:keepNext/>
-      </w:pPr>
-      <w:r>
-        <w:rPr>
-          <w:noProof/>
-        </w:rPr>
+        <w:lastRenderedPageBreak/>
         <w:drawing>
           <wp:inline distT="0" distB="0" distL="0" distR="0" wp14:anchorId="065957E7" wp14:editId="2C8DDF22">
             <wp:extent cx="5144218" cy="1505160"/>
@@ -3065,24 +2974,14 @@
       <w:r>
         <w:t xml:space="preserve">Screenshot </w:t>
       </w:r>
-      <w:r>
-        <w:fldChar w:fldCharType="begin"/>
-      </w:r>
-      <w:r>
-        <w:instrText xml:space="preserve"> SEQ Screenshot \* ARABIC </w:instrText>
-      </w:r>
-      <w:r>
-        <w:fldChar w:fldCharType="separate"/>
-      </w:r>
-      <w:r>
-        <w:rPr>
-          <w:noProof/>
-        </w:rPr>
-        <w:t>23</w:t>
-      </w:r>
-      <w:r>
-        <w:fldChar w:fldCharType="end"/>
-      </w:r>
+      <w:fldSimple w:instr=" SEQ Screenshot \* ARABIC ">
+        <w:r>
+          <w:rPr>
+            <w:noProof/>
+          </w:rPr>
+          <w:t>23</w:t>
+        </w:r>
+      </w:fldSimple>
       <w:r>
         <w:t>. Card for the new measure</w:t>
       </w:r>
@@ -3100,7 +2999,6 @@
           <w:b/>
           <w:bCs/>
         </w:rPr>
-        <w:lastRenderedPageBreak/>
         <w:t>Product Category Ranking:</w:t>
       </w:r>
     </w:p>
@@ -3197,24 +3095,14 @@
       <w:r>
         <w:t xml:space="preserve">Screenshot </w:t>
       </w:r>
-      <w:r>
-        <w:fldChar w:fldCharType="begin"/>
-      </w:r>
-      <w:r>
-        <w:instrText xml:space="preserve"> SEQ Screenshot \* ARABIC </w:instrText>
-      </w:r>
-      <w:r>
-        <w:fldChar w:fldCharType="separate"/>
-      </w:r>
-      <w:r>
-        <w:rPr>
-          <w:noProof/>
-        </w:rPr>
-        <w:t>24</w:t>
-      </w:r>
-      <w:r>
-        <w:fldChar w:fldCharType="end"/>
-      </w:r>
+      <w:fldSimple w:instr=" SEQ Screenshot \* ARABIC ">
+        <w:r>
+          <w:rPr>
+            <w:noProof/>
+          </w:rPr>
+          <w:t>24</w:t>
+        </w:r>
+      </w:fldSimple>
       <w:r>
         <w:t xml:space="preserve">. Measure to show </w:t>
       </w:r>
@@ -3275,24 +3163,14 @@
       <w:r>
         <w:t xml:space="preserve">Screenshot </w:t>
       </w:r>
-      <w:r>
-        <w:fldChar w:fldCharType="begin"/>
-      </w:r>
-      <w:r>
-        <w:instrText xml:space="preserve"> SEQ Screenshot \* ARABIC </w:instrText>
-      </w:r>
-      <w:r>
-        <w:fldChar w:fldCharType="separate"/>
-      </w:r>
-      <w:r>
-        <w:rPr>
-          <w:noProof/>
-        </w:rPr>
-        <w:t>25</w:t>
-      </w:r>
-      <w:r>
-        <w:fldChar w:fldCharType="end"/>
-      </w:r>
+      <w:fldSimple w:instr=" SEQ Screenshot \* ARABIC ">
+        <w:r>
+          <w:rPr>
+            <w:noProof/>
+          </w:rPr>
+          <w:t>25</w:t>
+        </w:r>
+      </w:fldSimple>
       <w:r>
         <w:t>. Using Rank measure to rank Product Categories</w:t>
       </w:r>
@@ -3303,6 +3181,7 @@
         <w:pStyle w:val="Heading2"/>
       </w:pPr>
       <w:r>
+        <w:lastRenderedPageBreak/>
         <w:t>3. Conclusion</w:t>
       </w:r>
     </w:p>

</xml_diff>